<commit_message>
ajout de maquette graphique pas fini
</commit_message>
<xml_diff>
--- a/Personnel/Compte-Rendu.docx
+++ b/Personnel/Compte-Rendu.docx
@@ -837,58 +837,23 @@
     </w:p>
     <w:p/>
     <w:p>
-      <w:pPr>
-        <w:ind w:left="708"/>
-      </w:pPr>
-      <w:proofErr w:type="spellStart"/>
-      <w:r>
-        <w:rPr>
-          <w:b/>
-        </w:rPr>
-        <w:t>GestionPersonnel</w:t>
-      </w:r>
-      <w:proofErr w:type="spellEnd"/>
-      <w:r>
-        <w:rPr>
-          <w:b/>
-        </w:rPr>
-        <w:t xml:space="preserve"> : </w:t>
-      </w:r>
-      <w:r>
-        <w:t>Permet de récupérer les données des employés et des ligues depuis la base de données et les associer pour créer un objet à son        nom (ligne 36 à 100).</w:t>
-      </w:r>
-    </w:p>
-    <w:p>
-      <w:pPr>
-        <w:ind w:left="708"/>
-        <w:rPr>
-          <w:b/>
-        </w:rPr>
-      </w:pPr>
-    </w:p>
-    <w:p>
-      <w:pPr>
-        <w:ind w:left="708"/>
-      </w:pPr>
-      <w:proofErr w:type="spellStart"/>
-      <w:r>
-        <w:rPr>
-          <w:b/>
-        </w:rPr>
-        <w:t>SauvegarderGestionPersonnel</w:t>
-      </w:r>
-      <w:proofErr w:type="spellEnd"/>
-      <w:r>
-        <w:rPr>
-          <w:b/>
-        </w:rPr>
-        <w:t xml:space="preserve"> : </w:t>
-      </w:r>
-      <w:r>
-        <w:t xml:space="preserve">Permet la fermeture </w:t>
-      </w:r>
-      <w:r>
-        <w:t>de la connexion à la base de données.</w:t>
+      <w:r>
+        <w:tab/>
+      </w:r>
+      <w:r>
+        <w:rPr>
+          <w:b/>
+        </w:rPr>
+        <w:t>JDBC</w:t>
+      </w:r>
+      <w:r>
+        <w:rPr>
+          <w:b/>
+        </w:rPr>
+        <w:t> :</w:t>
+      </w:r>
+      <w:r>
+        <w:t xml:space="preserve"> comme dit précédemment, il permet d’établir une connexion à la base de données.</w:t>
       </w:r>
       <w:r>
         <w:rPr>
@@ -897,14 +862,11 @@
         <w:t xml:space="preserve"> </w:t>
       </w:r>
       <w:r>
-        <w:rPr>
-          <w:noProof/>
-        </w:rPr>
         <w:drawing>
-          <wp:inline distT="0" distB="0" distL="0" distR="0" wp14:anchorId="39E96AFC" wp14:editId="34C664D0">
-            <wp:extent cx="4629150" cy="2456385"/>
-            <wp:effectExtent l="0" t="0" r="0" b="1270"/>
-            <wp:docPr id="8" name="Image 8"/>
+          <wp:inline distT="0" distB="0" distL="0" distR="0" wp14:anchorId="69CF48C5" wp14:editId="3F26158D">
+            <wp:extent cx="8892540" cy="3006725"/>
+            <wp:effectExtent l="0" t="0" r="3810" b="3175"/>
+            <wp:docPr id="10" name="Image 10"/>
             <wp:cNvGraphicFramePr>
               <a:graphicFrameLocks xmlns:a="http://schemas.openxmlformats.org/drawingml/2006/main" noChangeAspect="1"/>
             </wp:cNvGraphicFramePr>
@@ -924,6 +886,156 @@
                   <pic:spPr>
                     <a:xfrm>
                       <a:off x="0" y="0"/>
+                      <a:ext cx="8892540" cy="3006725"/>
+                    </a:xfrm>
+                    <a:prstGeom prst="rect">
+                      <a:avLst/>
+                    </a:prstGeom>
+                  </pic:spPr>
+                </pic:pic>
+              </a:graphicData>
+            </a:graphic>
+          </wp:inline>
+        </w:drawing>
+      </w:r>
+    </w:p>
+    <w:p/>
+    <w:p>
+      <w:pPr>
+        <w:ind w:left="708"/>
+      </w:pPr>
+      <w:proofErr w:type="spellStart"/>
+      <w:r>
+        <w:rPr>
+          <w:b/>
+        </w:rPr>
+        <w:t>GestionPersonnel</w:t>
+      </w:r>
+      <w:proofErr w:type="spellEnd"/>
+      <w:r>
+        <w:rPr>
+          <w:b/>
+        </w:rPr>
+        <w:t xml:space="preserve"> : </w:t>
+      </w:r>
+      <w:r>
+        <w:t>Permet de récupérer les données des employés et des ligues depuis la base de données et les associer pour créer un objet à son        nom (ligne 36 à 100).</w:t>
+      </w:r>
+    </w:p>
+    <w:p>
+      <w:pPr>
+        <w:ind w:left="708"/>
+      </w:pPr>
+      <w:r>
+        <w:rPr>
+          <w:b/>
+        </w:rPr>
+        <w:lastRenderedPageBreak/>
+        <w:t xml:space="preserve">Insert : </w:t>
+      </w:r>
+      <w:r>
+        <w:t>Permet d’ajouter un employé ou une ligue à la base de données.</w:t>
+      </w:r>
+    </w:p>
+    <w:p>
+      <w:pPr>
+        <w:ind w:left="708"/>
+      </w:pPr>
+      <w:r>
+        <w:rPr>
+          <w:b/>
+        </w:rPr>
+        <w:t>Update :</w:t>
+      </w:r>
+      <w:r>
+        <w:t xml:space="preserve"> Permet de modifier un employé ou une ligue à la base de données.</w:t>
+      </w:r>
+    </w:p>
+    <w:p>
+      <w:pPr>
+        <w:ind w:left="708"/>
+      </w:pPr>
+      <w:proofErr w:type="spellStart"/>
+      <w:r>
+        <w:rPr>
+          <w:b/>
+        </w:rPr>
+        <w:t>Delete</w:t>
+      </w:r>
+      <w:proofErr w:type="spellEnd"/>
+      <w:r>
+        <w:rPr>
+          <w:b/>
+        </w:rPr>
+        <w:t> :</w:t>
+      </w:r>
+      <w:r>
+        <w:t xml:space="preserve"> Permet de supprimer un employé ou une ligue à la base de données.</w:t>
+      </w:r>
+    </w:p>
+    <w:p>
+      <w:pPr>
+        <w:ind w:left="708"/>
+      </w:pPr>
+    </w:p>
+    <w:p>
+      <w:pPr>
+        <w:ind w:left="708"/>
+      </w:pPr>
+      <w:proofErr w:type="spellStart"/>
+      <w:r>
+        <w:rPr>
+          <w:b/>
+        </w:rPr>
+        <w:t>SauvegarderGestionPersonnel</w:t>
+      </w:r>
+      <w:proofErr w:type="spellEnd"/>
+      <w:r>
+        <w:rPr>
+          <w:b/>
+        </w:rPr>
+        <w:t xml:space="preserve"> : </w:t>
+      </w:r>
+      <w:r>
+        <w:t xml:space="preserve">Permet la fermeture </w:t>
+      </w:r>
+      <w:r>
+        <w:t>de la connexion à la base de données.</w:t>
+      </w:r>
+      <w:r>
+        <w:rPr>
+          <w:noProof/>
+        </w:rPr>
+        <w:t xml:space="preserve"> </w:t>
+      </w:r>
+      <w:r>
+        <w:rPr>
+          <w:noProof/>
+        </w:rPr>
+        <w:drawing>
+          <wp:inline distT="0" distB="0" distL="0" distR="0" wp14:anchorId="39E96AFC" wp14:editId="34C664D0">
+            <wp:extent cx="4629150" cy="2456385"/>
+            <wp:effectExtent l="0" t="0" r="0" b="1270"/>
+            <wp:docPr id="8" name="Image 8"/>
+            <wp:cNvGraphicFramePr>
+              <a:graphicFrameLocks xmlns:a="http://schemas.openxmlformats.org/drawingml/2006/main" noChangeAspect="1"/>
+            </wp:cNvGraphicFramePr>
+            <a:graphic xmlns:a="http://schemas.openxmlformats.org/drawingml/2006/main">
+              <a:graphicData uri="http://schemas.openxmlformats.org/drawingml/2006/picture">
+                <pic:pic xmlns:pic="http://schemas.openxmlformats.org/drawingml/2006/picture">
+                  <pic:nvPicPr>
+                    <pic:cNvPr id="1" name=""/>
+                    <pic:cNvPicPr/>
+                  </pic:nvPicPr>
+                  <pic:blipFill>
+                    <a:blip r:embed="rId16"/>
+                    <a:stretch>
+                      <a:fillRect/>
+                    </a:stretch>
+                  </pic:blipFill>
+                  <pic:spPr>
+                    <a:xfrm>
+                      <a:off x="0" y="0"/>
                       <a:ext cx="4675598" cy="2481032"/>
                     </a:xfrm>
                     <a:prstGeom prst="rect">
@@ -939,20 +1051,106 @@
     </w:p>
     <w:p/>
     <w:p/>
-    <w:p>
-      <w:r>
-        <w:lastRenderedPageBreak/>
-        <w:tab/>
+    <w:p/>
+    <w:p/>
+    <w:p/>
+    <w:p/>
+    <w:p/>
+    <w:p>
+      <w:pPr>
+        <w:pStyle w:val="Titre2"/>
+      </w:pPr>
+      <w:r>
+        <w:t>Création de la maquette pour l’interface graphique :</w:t>
+      </w:r>
+    </w:p>
+    <w:p/>
+    <w:p>
+      <w:r>
+        <w:t xml:space="preserve">La création de la maquette permet de visualiser l’interface de l’application pour ce projet. </w:t>
+      </w:r>
+      <w:r>
+        <w:t xml:space="preserve">L’interface graphique est une représentation </w:t>
+      </w:r>
+      <w:r>
+        <w:t>de la maquette créée ci-dessus, permettant la visualisation des fonctionnalités de tout les codes ainsi que de leurs outils.</w:t>
+      </w:r>
+    </w:p>
+    <w:p>
+      <w:r>
+        <w:drawing>
+          <wp:anchor distT="0" distB="0" distL="114300" distR="114300" simplePos="0" relativeHeight="251658240" behindDoc="0" locked="0" layoutInCell="1" allowOverlap="1" wp14:anchorId="7ABFC4B2" wp14:editId="4630EB8D">
+            <wp:simplePos x="895350" y="2162175"/>
+            <wp:positionH relativeFrom="column">
+              <wp:align>left</wp:align>
+            </wp:positionH>
+            <wp:positionV relativeFrom="paragraph">
+              <wp:align>top</wp:align>
+            </wp:positionV>
+            <wp:extent cx="5781675" cy="3253740"/>
+            <wp:effectExtent l="0" t="0" r="9525" b="3810"/>
+            <wp:wrapSquare wrapText="bothSides"/>
+            <wp:docPr id="11" name="Image 11"/>
+            <wp:cNvGraphicFramePr>
+              <a:graphicFrameLocks xmlns:a="http://schemas.openxmlformats.org/drawingml/2006/main" noChangeAspect="1"/>
+            </wp:cNvGraphicFramePr>
+            <a:graphic xmlns:a="http://schemas.openxmlformats.org/drawingml/2006/main">
+              <a:graphicData uri="http://schemas.openxmlformats.org/drawingml/2006/picture">
+                <pic:pic xmlns:pic="http://schemas.openxmlformats.org/drawingml/2006/picture">
+                  <pic:nvPicPr>
+                    <pic:cNvPr id="1" name=""/>
+                    <pic:cNvPicPr/>
+                  </pic:nvPicPr>
+                  <pic:blipFill>
+                    <a:blip r:embed="rId17">
+                      <a:extLst>
+                        <a:ext uri="{28A0092B-C50C-407E-A947-70E740481C1C}">
+                          <a14:useLocalDpi xmlns:a14="http://schemas.microsoft.com/office/drawing/2010/main" val="0"/>
+                        </a:ext>
+                      </a:extLst>
+                    </a:blip>
+                    <a:stretch>
+                      <a:fillRect/>
+                    </a:stretch>
+                  </pic:blipFill>
+                  <pic:spPr>
+                    <a:xfrm>
+                      <a:off x="0" y="0"/>
+                      <a:ext cx="5781675" cy="3253740"/>
+                    </a:xfrm>
+                    <a:prstGeom prst="rect">
+                      <a:avLst/>
+                    </a:prstGeom>
+                  </pic:spPr>
+                </pic:pic>
+              </a:graphicData>
+            </a:graphic>
+          </wp:anchor>
+        </w:drawing>
+      </w:r>
+      <w:r>
+        <w:br w:type="textWrapping" w:clear="all"/>
+      </w:r>
+    </w:p>
+    <w:p>
+      <w:r>
+        <w:t xml:space="preserve">Lien de toute l’interface graphique : </w:t>
+      </w:r>
+      <w:r>
+        <w:t>https://github.com/WassimElArche/personnel/blob/master/Personnel/Maquette%20graphique.pdf</w:t>
       </w:r>
       <w:bookmarkStart w:id="0" w:name="_GoBack"/>
       <w:bookmarkEnd w:id="0"/>
     </w:p>
     <w:p/>
-    <w:p/>
-    <w:p/>
+    <w:p>
+      <w:r>
+        <w:tab/>
+      </w:r>
+    </w:p>
     <w:sectPr>
-      <w:headerReference w:type="default" r:id="rId16"/>
-      <w:footerReference w:type="default" r:id="rId17"/>
+      <w:headerReference w:type="default" r:id="rId18"/>
+      <w:footerReference w:type="default" r:id="rId19"/>
       <w:pgSz w:w="16838" w:h="11906" w:orient="landscape"/>
       <w:pgMar w:top="1417" w:right="1417" w:bottom="1417" w:left="1417" w:header="708" w:footer="708" w:gutter="0"/>
       <w:cols w:space="708"/>

</xml_diff>

<commit_message>
fin de la maquette
</commit_message>
<xml_diff>
--- a/Personnel/Compte-Rendu.docx
+++ b/Personnel/Compte-Rendu.docx
@@ -396,7 +396,15 @@
         <w:ind w:left="705"/>
       </w:pPr>
       <w:r>
-        <w:t>Tout cela permet l’efficacité de la gestion des ligues, des employés et de leur relation tout en étant cohérent.</w:t>
+        <w:t xml:space="preserve">Tout cela permet l’efficacité de la gestion des ligues, </w:t>
+      </w:r>
+      <w:r>
+        <w:t>d</w:t>
+      </w:r>
+      <w:bookmarkStart w:id="0" w:name="_GoBack"/>
+      <w:bookmarkEnd w:id="0"/>
+      <w:r>
+        <w:t>des employés et de leur relation tout en étant cohérent.</w:t>
       </w:r>
     </w:p>
     <w:p>
@@ -899,7 +907,14 @@
         </w:drawing>
       </w:r>
     </w:p>
-    <w:p/>
+    <w:p>
+      <w:r>
+        <w:t xml:space="preserve"> </w:t>
+      </w:r>
+      <w:r>
+        <w:t xml:space="preserve"> </w:t>
+      </w:r>
+    </w:p>
     <w:p>
       <w:pPr>
         <w:ind w:left="708"/>
@@ -1139,8 +1154,6 @@
       <w:r>
         <w:t>https://github.com/WassimElArche/personnel/blob/master/Personnel/Maquette%20graphique.pdf</w:t>
       </w:r>
-      <w:bookmarkStart w:id="0" w:name="_GoBack"/>
-      <w:bookmarkEnd w:id="0"/>
     </w:p>
     <w:p/>
     <w:p>

</xml_diff>